<commit_message>
AIOffice 1.13.0 (docx): set / accepts document-level protection (w:documentProtection edit modes + w:writeProtection readOnlyRecommended), get / reports it
- set / with props now writes enforcement-flag protection into settings.xml,
  mirroring xlsx set / carrying workbook protection. protection:{edit,enforce?}
  -> w:documentProtection @w:edit + @w:enforcement; readOnlyRecommended ->
  w:writeProtection @w:recommended. edit:none / enforce:false removes it.
- password inside protection is accepted but ignored (flag enforcement, not
  encryption; strong encryption out of scope, CONTRACT §10).
- get / reports {protection:{edit,enforced}, readOnlyRecommended} (type document).
- propless / non-set root ops keep the unsupported_feature refusal (now also
  pointing at protection).
- MCP ReplaceSugarTests root-rejection test updated: a propless-of-protection
  root set is now invalid_args+candidates instead of unsupported_feature (still
  a hard rejection, nothing written).
</commit_message>
<xml_diff>
--- a/fixtures/manual-check/word-sample.docx
+++ b/fixtures/manual-check/word-sample.docx
@@ -21,12 +21,12 @@
       </w:r>
     </w:p>
     <w:p>
-      <w:del w:author="Reviewer" w:date="2026-06-15T15:41:13Z" w:id="1">
+      <w:del w:author="Reviewer" w:date="2026-06-20T00:33:31Z" w:id="1">
         <w:r>
           <w:delText>Open this file in Word: heading, formatting and table below must look right.</w:delText>
         </w:r>
       </w:del>
-      <w:ins w:author="Reviewer" w:date="2026-06-15T15:41:13Z" w:id="2">
+      <w:ins w:author="Reviewer" w:date="2026-06-20T00:33:31Z" w:id="2">
         <w:r>
           <w:t>Open this file in Word: heading, formatting, table, styles, image, comment + threaded reply, numbered/bulleted lists, links, footnote, landscape A4 pages and ONE PENDING tracked change must look right.</w:t>
         </w:r>
@@ -186,7 +186,7 @@
                     <pic:cNvPicPr/>
                   </pic:nvPicPr>
                   <pic:blipFill>
-                    <a:blip r:embed="R5d1cddcbf538488f"/>
+                    <a:blip r:embed="R871e0ee9730e4a97"/>
                     <a:stretch>
                       <a:fillRect/>
                     </a:stretch>
@@ -273,7 +273,7 @@
       <w:r>
         <w:t xml:space="preserve">This sentence carries two links and a footnote: </w:t>
       </w:r>
-      <w:hyperlink r:id="Rb0e37a8e89f64651">
+      <w:hyperlink r:id="R190b09f366704b54">
         <w:r>
           <w:rPr>
             <w:rStyle w:val="Hyperlink"/>
@@ -297,8 +297,8 @@
       </w:r>
     </w:p>
     <w:sectPr>
-      <w:footerReference w:type="default" r:id="Rb1a743aa15654ae0"/>
-      <w:headerReference w:type="default" r:id="Rd9e6da83246844f1"/>
+      <w:footerReference w:type="default" r:id="R2bb1d988ccc94faa"/>
+      <w:headerReference w:type="default" r:id="R2521c92485944f17"/>
       <w:pgSz w:w="16838" w:h="11906" w:orient="landscape"/>
       <w:pgMar w:top="1134" w:right="1440" w:bottom="1134" w:left="1440" w:header="720" w:footer="720" w:gutter="0"/>
     </w:sectPr>
@@ -308,14 +308,14 @@
 
 <file path=word/comments.xml><?xml version="1.0" encoding="utf-8"?>
 <w:comments xmlns:w="http://schemas.openxmlformats.org/wordprocessingml/2006/main" xmlns:w14="http://schemas.microsoft.com/office/word/2010/wordml" xmlns:mc="http://schemas.openxmlformats.org/markup-compatibility/2006" mc:Ignorable="w14">
-  <w:comment w:author="Reviewer" w:date="2026-06-15T15:41:13.864505Z" w:id="1">
+  <w:comment w:author="Reviewer" w:date="2026-06-20T00:33:31.697393Z" w:id="1">
     <w:p>
       <w:r>
         <w:t>Comment written by aioffice — visible in the review pane.</w:t>
       </w:r>
     </w:p>
   </w:comment>
-  <w:comment w:author="Author" w:date="2026-06-15T15:41:13.903992Z" w:id="2">
+  <w:comment w:author="Author" w:date="2026-06-20T00:33:31.704303Z" w:id="2">
     <w:p>
       <w:r>
         <w:t>Reply written by aioffice — must thread under the first comment.</w:t>

</xml_diff>